<commit_message>
Publish final VCF Offline Depot 1.1.0 build 2026-09-13.1 guides and qualification
</commit_message>
<xml_diff>
--- a/VCF-Offline-Depot-Administrator-Guide.docx
+++ b/VCF-Offline-Depot-Administrator-Guide.docx
@@ -19,40 +19,37 @@
       </w:r>
     </w:p>
     <w:p>
-      <w:r/>
+      <w:r>
+        <w:t>Release baseline: Appliance 1.1.0 - distribution build 2026-09-13.1</w:t>
+      </w:r>
       <w:r>
         <w:rPr>
           <w:b/>
         </w:rPr>
-        <w:t>Release baseline:</w:t>
-      </w:r>
-      <w:r>
-        <w:t xml:space="preserve"> Appliance 1.1.0 - distribution build 2026-09-07.1</w:t>
-      </w:r>
-    </w:p>
-    <w:p>
+      </w:r>
       <w:r/>
+    </w:p>
+    <w:p>
+      <w:r>
+        <w:t>Documentation revision: 2.0 — 13 September 2026</w:t>
+      </w:r>
       <w:r>
         <w:rPr>
           <w:b/>
         </w:rPr>
-        <w:t>Documentation revision:</w:t>
-      </w:r>
-      <w:r>
-        <w:t xml:space="preserve"> 1.9 — 7 September 2026</w:t>
-      </w:r>
-    </w:p>
-    <w:p>
+      </w:r>
       <w:r/>
+    </w:p>
+    <w:p>
+      <w:r>
+        <w:t>Release status: Version 1.1.0 maintenance release. Consult the signed release record for validation of this exact OVA.</w:t>
+      </w:r>
       <w:r>
         <w:rPr>
           <w:b/>
         </w:rPr>
-        <w:t>Release status:</w:t>
-      </w:r>
-      <w:r>
-        <w:t xml:space="preserve"> Version 1.1.0 maintenance release. Consult the signed release record for validation of this exact OVA. VCF Installer remains the supported integration scope; SDDC Manager and Fleet Manager qualification remains deferred.</w:t>
-      </w:r>
+      </w:r>
+      <w:r/>
     </w:p>
     <w:p>
       <w:r/>
@@ -317,17 +314,14 @@
     </w:p>
     <w:p>
       <w:r>
-        <w:t xml:space="preserve">The supported integration scope is </w:t>
+        <w:t>The supported integration scope is VCF Installer. Validate configuration and retrieval in your own environment before replacement.</w:t>
       </w:r>
       <w:r>
         <w:rPr>
           <w:b/>
         </w:rPr>
-        <w:t>VCF Installer</w:t>
-      </w:r>
-      <w:r>
-        <w:t>. Validate configuration and retrieval in your own environment before replacement. SDDC Manager and Fleet Manager integration is planned for a later qualified update.</w:t>
-      </w:r>
+      </w:r>
+      <w:r/>
     </w:p>
     <w:p>
       <w:pPr>
@@ -4182,26 +4176,20 @@
         </w:numPr>
       </w:pPr>
       <w:r>
-        <w:t xml:space="preserve">Select </w:t>
+        <w:t>Select Test connection. Certificate retrieval starts automatically; Configure endpoint uses the same approval flow. For VCF Installer, the normal form has no separate certificate section or retrieval button.</w:t>
       </w:r>
       <w:r>
         <w:rPr>
           <w:b/>
         </w:rPr>
-        <w:t>Test connection</w:t>
-      </w:r>
-      <w:r>
-        <w:t xml:space="preserve">. Certificate retrieval starts automatically; </w:t>
-      </w:r>
+      </w:r>
+      <w:r/>
       <w:r>
         <w:rPr>
           <w:b/>
         </w:rPr>
-        <w:t>Configure endpoint</w:t>
-      </w:r>
-      <w:r>
-        <w:t xml:space="preserve"> uses the same approval flow. For VCF Installer, the normal form has no separate certificate section or retrieval button. Fleet Manager and SDDC Manager retain their visible certificate-trust section, uploads, and retrieval button.</w:t>
-      </w:r>
+      </w:r>
+      <w:r/>
     </w:p>
     <w:p>
       <w:pPr>
@@ -4453,9 +4441,7 @@
       </w:r>
     </w:p>
     <w:p>
-      <w:r>
-        <w:t>Do not configure SDDC Manager or Fleet Manager in production with this release.</w:t>
-      </w:r>
+      <w:r/>
     </w:p>
     <w:p>
       <w:pPr>
@@ -4956,6 +4942,89 @@
     <w:p>
       <w:r>
         <w:t>Use the Troubleshooting Guide's console recovery procedure if web credentials are lost. Store the separate recovery password in a vault and restrict vCenter/ESXi console permissions.</w:t>
+      </w:r>
+    </w:p>
+    <w:p>
+      <w:r>
+        <w:br w:type="page"/>
+      </w:r>
+    </w:p>
+    <w:p>
+      <w:pPr>
+        <w:pStyle w:val="Heading1"/>
+      </w:pPr>
+      <w:r>
+        <w:t>Final build 2026 09 13 updates</w:t>
+      </w:r>
+    </w:p>
+    <w:p>
+      <w:r>
+        <w:t>This appliance is intended for VCF 9.1 and newer, with workflow testing demonstrated on VCF 9.1.1. VCF Installer is the supported connection target. Verify compatibility before adopting a later VCF release.</w:t>
+      </w:r>
+    </w:p>
+    <w:p>
+      <w:pPr>
+        <w:pStyle w:val="Heading2"/>
+      </w:pPr>
+      <w:r>
+        <w:t>Installer downloads</w:t>
+      </w:r>
+    </w:p>
+    <w:p>
+      <w:r>
+        <w:t>Authorize &amp; Download includes controls for initial deployment and later release retrieval by a saved VCF Installer. Select the Installer and a release available on the depot, supply the required Installer credentials, refresh availability, and start retrieval. Follow the displayed task status; depot download completion and Installer retrieval are separate operations.</w:t>
+      </w:r>
+    </w:p>
+    <w:p>
+      <w:pPr>
+        <w:pStyle w:val="Heading2"/>
+      </w:pPr>
+      <w:r>
+        <w:t>Restricted service account</w:t>
+      </w:r>
+    </w:p>
+    <w:p>
+      <w:r>
+        <w:t>The management web service runs as depot-web with no new privileges. A root-owned helper accepts only allowed operations through a local Unix socket. Do not grant the web service root access or access to the Docker socket to troubleshoot a failed download.</w:t>
+      </w:r>
+    </w:p>
+    <w:p>
+      <w:pPr>
+        <w:pStyle w:val="Heading2"/>
+      </w:pPr>
+      <w:r>
+        <w:t>Network recovery and signed updates</w:t>
+      </w:r>
+    </w:p>
+    <w:p>
+      <w:r>
+        <w:t>Network changes require confirmation and have a recovery deadline. Confirm working connectivity before that deadline. Signed application updates are validated by the privileged helper and retain an application rollback and protected configuration snapshot.</w:t>
+      </w:r>
+    </w:p>
+    <w:p>
+      <w:pPr>
+        <w:pStyle w:val="Heading2"/>
+      </w:pPr>
+      <w:r>
+        <w:t>Health and diagnostics</w:t>
+      </w:r>
+    </w:p>
+    <w:p>
+      <w:r>
+        <w:t>Appliance Status collects diagnostics asynchronously and displays measurement age. Unknown storage or certificate readings and a stopped content container produce health alerts. Repeated support bundle requests are limited while collection is in progress.</w:t>
+      </w:r>
+    </w:p>
+    <w:p>
+      <w:pPr>
+        <w:pStyle w:val="Heading2"/>
+      </w:pPr>
+      <w:r>
+        <w:t>Download validation</w:t>
+      </w:r>
+    </w:p>
+    <w:p>
+      <w:r>
+        <w:t>The final live runtime successfully refreshed Broadcom metadata after re-registration. Existing binaries were retained, so that check did not transfer a fresh binary payload. Metadata and ESX installer ISO retrieval over authenticated HTTPS passed. Consult release-record.json for fresh deployment results for the exact public OVA.</w:t>
       </w:r>
     </w:p>
     <w:sectPr>
@@ -4978,7 +5047,7 @@
       <w:jc w:val="right"/>
     </w:pPr>
     <w:r>
-      <w:t xml:space="preserve">Revision 1.9  |  7 September 2026  |  </w:t>
+      <w:t xml:space="preserve">Revision 2.0  |  13 September 2026  |  </w:t>
     </w:r>
     <w:fldSimple w:instr="PAGE"/>
   </w:p>

</xml_diff>